<commit_message>
Add Implementation 02 to master Project Prompt log + milestone highlight
Logs Prompt 02 (repository hygiene / public-asset cleanup) verbatim with
its outcome, and adds a highlighted milestone callout marking the first
structural repo-hygiene milestone: ~63MB of tracked leakage excluded from
the public deploy with zero data loss and zero production impact.

Co-Authored-By: Claude Sonnet 5 <noreply@anthropic.com>
Claude-Session: https://claude.ai/code/session_01NXemYjiiKgcxUzQN7iGVyh
</commit_message>
<xml_diff>
--- a/docs/FINTECHOSIS_Master_Project_Prompts.docx
+++ b/docs/FINTECHOSIS_Master_Project_Prompts.docx
@@ -863,6 +863,405 @@
     </w:p>
     <w:p>
       <w:pPr>
+        <w:spacing w:before="280" w:after="40"/>
+      </w:pPr>
+      <w:r>
+        <w:rPr>
+          <w:b/>
+          <w:color w:val="071A2F"/>
+          <w:sz w:val="30"/>
+        </w:rPr>
+        <w:t>3.  Implementation 02 -- Repository Hygiene and Public-Asset Cleanup</w:t>
+      </w:r>
+    </w:p>
+    <w:p>
+      <w:pPr>
+        <w:spacing w:after="200"/>
+      </w:pPr>
+      <w:r>
+        <w:rPr>
+          <w:i/>
+          <w:color w:val="555F70"/>
+          <w:sz w:val="19"/>
+        </w:rPr>
+        <w:t>Date: 22 August 2026    |    Status: Completed and pushed (commit 553699c)</w:t>
+      </w:r>
+    </w:p>
+    <w:p>
+      <w:pPr>
+        <w:spacing w:after="80"/>
+      </w:pPr>
+      <w:r>
+        <w:rPr>
+          <w:b/>
+          <w:color w:val="B8863B"/>
+          <w:sz w:val="20"/>
+        </w:rPr>
+        <w:t>PROMPT (verbatim)</w:t>
+      </w:r>
+    </w:p>
+    <w:p>
+      <w:pPr>
+        <w:spacing w:after="80"/>
+        <w:ind w:left="360"/>
+      </w:pPr>
+      <w:r>
+        <w:rPr>
+          <w:rFonts w:ascii="Consolas" w:hAnsi="Consolas"/>
+          <w:sz w:val="20"/>
+        </w:rPr>
+        <w:t>PROMPT 02 -- CLEAN THE REPOSITORY</w:t>
+      </w:r>
+    </w:p>
+    <w:p>
+      <w:pPr>
+        <w:spacing w:after="80"/>
+        <w:ind w:left="360"/>
+      </w:pPr>
+      <w:r>
+        <w:rPr>
+          <w:rFonts w:ascii="Consolas" w:hAnsi="Consolas"/>
+          <w:sz w:val="20"/>
+        </w:rPr>
+        <w:t>FINTECHOSIS -- IMPLEMENTATION 02</w:t>
+      </w:r>
+    </w:p>
+    <w:p>
+      <w:pPr>
+        <w:spacing w:after="80"/>
+        <w:ind w:left="360"/>
+      </w:pPr>
+      <w:r>
+        <w:rPr>
+          <w:rFonts w:ascii="Consolas" w:hAnsi="Consolas"/>
+          <w:sz w:val="20"/>
+        </w:rPr>
+        <w:t>REPOSITORY HYGIENE AND PUBLIC-ASSET CLEANUP</w:t>
+      </w:r>
+    </w:p>
+    <w:p>
+      <w:pPr>
+        <w:spacing w:after="80"/>
+        <w:ind w:left="360"/>
+      </w:pPr>
+      <w:r>
+        <w:rPr>
+          <w:rFonts w:ascii="Consolas" w:hAnsi="Consolas"/>
+          <w:sz w:val="20"/>
+        </w:rPr>
+      </w:r>
+    </w:p>
+    <w:p>
+      <w:pPr>
+        <w:spacing w:after="80"/>
+        <w:ind w:left="360"/>
+      </w:pPr>
+      <w:r>
+        <w:rPr>
+          <w:rFonts w:ascii="Consolas" w:hAnsi="Consolas"/>
+          <w:sz w:val="20"/>
+        </w:rPr>
+        <w:t>The existing repository contains approximately 63MB of tracked files identified by the architecture audit as unreferenced or staging material. Do NOT blindly delete files.</w:t>
+      </w:r>
+    </w:p>
+    <w:p>
+      <w:pPr>
+        <w:spacing w:after="80"/>
+        <w:ind w:left="360"/>
+      </w:pPr>
+      <w:r>
+        <w:rPr>
+          <w:rFonts w:ascii="Consolas" w:hAnsi="Consolas"/>
+          <w:sz w:val="20"/>
+        </w:rPr>
+      </w:r>
+    </w:p>
+    <w:p>
+      <w:pPr>
+        <w:spacing w:after="80"/>
+        <w:ind w:left="360"/>
+      </w:pPr>
+      <w:r>
+        <w:rPr>
+          <w:rFonts w:ascii="Consolas" w:hAnsi="Consolas"/>
+          <w:sz w:val="20"/>
+        </w:rPr>
+        <w:t>First classify every identified item into: A. REQUIRED FOR PRODUCTION, B. REQUIRED SOURCE ASSET, C. ARCHIVE, D. DEVELOPMENT ONLY, E. SUPERSEDED, F. DUPLICATE, G. UNKNOWN -- DO NOT DELETE.</w:t>
+      </w:r>
+    </w:p>
+    <w:p>
+      <w:pPr>
+        <w:spacing w:after="80"/>
+        <w:ind w:left="360"/>
+      </w:pPr>
+      <w:r>
+        <w:rPr>
+          <w:rFonts w:ascii="Consolas" w:hAnsi="Consolas"/>
+          <w:sz w:val="20"/>
+        </w:rPr>
+      </w:r>
+    </w:p>
+    <w:p>
+      <w:pPr>
+        <w:spacing w:after="80"/>
+        <w:ind w:left="360"/>
+      </w:pPr>
+      <w:r>
+        <w:rPr>
+          <w:rFonts w:ascii="Consolas" w:hAnsi="Consolas"/>
+          <w:sz w:val="20"/>
+        </w:rPr>
+        <w:t>Review: 0001uiuxfixes.patch; Menu Heading.xlsx; Privacy Policy 13-Aug-2026.docx; Archive/; Master-Libraries/; assets/master-libraries/; superseded MP-017/018/019 assets; 16 empty HTML stubs; pages/template.html; orphaned global-payments-landscape.html; duplicate logo files.</w:t>
+      </w:r>
+    </w:p>
+    <w:p>
+      <w:pPr>
+        <w:spacing w:after="80"/>
+        <w:ind w:left="360"/>
+      </w:pPr>
+      <w:r>
+        <w:rPr>
+          <w:rFonts w:ascii="Consolas" w:hAnsi="Consolas"/>
+          <w:sz w:val="20"/>
+        </w:rPr>
+      </w:r>
+    </w:p>
+    <w:p>
+      <w:pPr>
+        <w:spacing w:after="80"/>
+        <w:ind w:left="360"/>
+      </w:pPr>
+      <w:r>
+        <w:rPr>
+          <w:rFonts w:ascii="Consolas" w:hAnsi="Consolas"/>
+          <w:sz w:val="20"/>
+        </w:rPr>
+        <w:t>Do not delete anything classified UNKNOWN.</w:t>
+      </w:r>
+    </w:p>
+    <w:p>
+      <w:pPr>
+        <w:spacing w:after="80"/>
+        <w:ind w:left="360"/>
+      </w:pPr>
+      <w:r>
+        <w:rPr>
+          <w:rFonts w:ascii="Consolas" w:hAnsi="Consolas"/>
+          <w:sz w:val="20"/>
+        </w:rPr>
+      </w:r>
+    </w:p>
+    <w:p>
+      <w:pPr>
+        <w:spacing w:after="80"/>
+        <w:ind w:left="360"/>
+      </w:pPr>
+      <w:r>
+        <w:rPr>
+          <w:rFonts w:ascii="Consolas" w:hAnsi="Consolas"/>
+          <w:sz w:val="20"/>
+        </w:rPr>
+        <w:t>For production-only files that are clearly unnecessary: remove from the deployable repository where safe; preserve legitimate source material outside the public deployment path where appropriate; add an appropriate .gitignore; remove true duplicate assets only after confirming all references.</w:t>
+      </w:r>
+    </w:p>
+    <w:p>
+      <w:pPr>
+        <w:spacing w:after="80"/>
+        <w:ind w:left="360"/>
+      </w:pPr>
+      <w:r>
+        <w:rPr>
+          <w:rFonts w:ascii="Consolas" w:hAnsi="Consolas"/>
+          <w:sz w:val="20"/>
+        </w:rPr>
+      </w:r>
+    </w:p>
+    <w:p>
+      <w:pPr>
+        <w:spacing w:after="80"/>
+        <w:ind w:left="360"/>
+      </w:pPr>
+      <w:r>
+        <w:rPr>
+          <w:rFonts w:ascii="Consolas" w:hAnsi="Consolas"/>
+          <w:sz w:val="20"/>
+        </w:rPr>
+        <w:t>Do NOT modify: working dashboard gallery assets; active intelligence pages; active country pages; active design-system assets; performance assets. Do not change website design.</w:t>
+      </w:r>
+    </w:p>
+    <w:p>
+      <w:pPr>
+        <w:spacing w:after="80"/>
+        <w:ind w:left="360"/>
+      </w:pPr>
+      <w:r>
+        <w:rPr>
+          <w:rFonts w:ascii="Consolas" w:hAnsi="Consolas"/>
+          <w:sz w:val="20"/>
+        </w:rPr>
+      </w:r>
+    </w:p>
+    <w:p>
+      <w:pPr>
+        <w:spacing w:after="80"/>
+        <w:ind w:left="360"/>
+      </w:pPr>
+      <w:r>
+        <w:rPr>
+          <w:rFonts w:ascii="Consolas" w:hAnsi="Consolas"/>
+          <w:sz w:val="20"/>
+        </w:rPr>
+        <w:t>At completion report: files removed; files retained; files moved/archived; duplicates removed; .gitignore changes; references checked; production impact.</w:t>
+      </w:r>
+    </w:p>
+    <w:p>
+      <w:pPr>
+        <w:spacing w:before="200" w:after="80"/>
+      </w:pPr>
+      <w:r>
+        <w:rPr>
+          <w:b/>
+          <w:color w:val="B8863B"/>
+          <w:sz w:val="20"/>
+        </w:rPr>
+        <w:t>OUTCOME</w:t>
+      </w:r>
+    </w:p>
+    <w:p>
+      <w:pPr>
+        <w:pStyle w:val="ListBullet"/>
+        <w:ind w:left="360"/>
+      </w:pPr>
+      <w:r>
+        <w:rPr>
+          <w:sz w:val="20"/>
+        </w:rPr>
+        <w:t>Classified every named item under A-G; nothing classified UNKNOWN was deleted (the unreferenced fo-logo-horizontal-white.*/fo-logo-stacked-white.* logo variants discovered during the reference check were left in place for the same reason -- not part of the audit's named duplicate pair, flagged in the report instead of removed).</w:t>
+      </w:r>
+    </w:p>
+    <w:p>
+      <w:pPr>
+        <w:pStyle w:val="ListBullet"/>
+        <w:ind w:left="360"/>
+      </w:pPr>
+      <w:r>
+        <w:rPr>
+          <w:sz w:val="20"/>
+        </w:rPr>
+        <w:t>Resolved the durability conflict this task exposed: this session's container is ephemeral, so simply untracking files from git (git rm --cached) would have silently destroyed them the moment the session ended -- the opposite of "preserve." Confirmed with the user first, then used GitHub Pages' default Jekyll behaviour (no .nojekyll present) to rename source/staging material into underscore-prefixed directories, which Jekyll excludes from the built site automatically while git keeps it fully tracked and versioned. Verified zero {{ / {% sequences anywhere in the codebase first, so there's no Jekyll/Liquid parsing risk.</w:t>
+      </w:r>
+    </w:p>
+    <w:p>
+      <w:pPr>
+        <w:pStyle w:val="ListBullet"/>
+        <w:ind w:left="360"/>
+      </w:pPr>
+      <w:r>
+        <w:rPr>
+          <w:sz w:val="20"/>
+        </w:rPr>
+        <w:t>Moved (preserved, excluded from the live deploy): Archive/ -&gt; _archive/, Master-Libraries/ -&gt; _master-libraries/, assets/master-libraries/ -&gt; assets/_master-libraries/, MP-017/018/019 -&gt; assets/maps/intelligence/_MP-0{17,18,19}/, the three root dev files -&gt; _dev-archive/, and the real-content pre-rebuild orphan page -&gt; pages/_archive/.</w:t>
+      </w:r>
+    </w:p>
+    <w:p>
+      <w:pPr>
+        <w:pStyle w:val="ListBullet"/>
+        <w:ind w:left="360"/>
+      </w:pPr>
+      <w:r>
+        <w:rPr>
+          <w:sz w:val="20"/>
+        </w:rPr>
+        <w:t>Removed outright (zero content, zero references, confirmed by grep first): all 16 empty HTML stubs, pages/template.html, and the byte-identical duplicate logo pair (fo-logo-stacked.png/svg, sha1-verified against fo-logo.png/svg).</w:t>
+      </w:r>
+    </w:p>
+    <w:p>
+      <w:pPr>
+        <w:pStyle w:val="ListBullet"/>
+        <w:ind w:left="360"/>
+      </w:pPr>
+      <w:r>
+        <w:rPr>
+          <w:sz w:val="20"/>
+        </w:rPr>
+        <w:t>Updated scripts/gpir-perf-audit.js's directory walk to skip underscore-prefixed dirs generically, replacing the old hardcoded "Archive"/"master-libraries" exclusion list so the convention holds for any future archived material too.</w:t>
+      </w:r>
+    </w:p>
+    <w:p>
+      <w:pPr>
+        <w:pStyle w:val="ListBullet"/>
+        <w:ind w:left="360"/>
+      </w:pPr>
+      <w:r>
+        <w:rPr>
+          <w:sz w:val="20"/>
+        </w:rPr>
+        <w:t>Added .gitignore (OS/editor cruft, stray root docx/xlsx/patch files, node_modules/).</w:t>
+      </w:r>
+    </w:p>
+    <w:p>
+      <w:pPr>
+        <w:pStyle w:val="ListBullet"/>
+        <w:ind w:left="360"/>
+      </w:pPr>
+      <w:r>
+        <w:rPr>
+          <w:sz w:val="20"/>
+        </w:rPr>
+        <w:t>Verified zero production impact: broken-link sweep 0/7056 on the live site, gpir-perf-audit.js clean (0 warnings), and a full page-load + dashboard-lightbox + logo-asset smoke test across 6 representative pages all passed after the cleanup.</w:t>
+      </w:r>
+    </w:p>
+    <w:p>
+      <w:pPr>
+        <w:pStyle w:val="ListBullet"/>
+        <w:ind w:left="360"/>
+      </w:pPr>
+      <w:r>
+        <w:rPr>
+          <w:sz w:val="20"/>
+        </w:rPr>
+        <w:t>Committed and pushed to claude/website-ui-ux-design-d87as5 (commit 553699c).</w:t>
+      </w:r>
+    </w:p>
+    <w:p>
+      <w:pPr>
+        <w:spacing w:before="200" w:after="200"/>
+        <w:ind w:left="216" w:right="216"/>
+        <w:shd w:val="clear" w:color="auto" w:fill="FBF3E6"/>
+        <w:pBdr>
+          <w:top w:val="single" w:sz="4" w:space="6" w:color="B8863B"/>
+          <w:bottom w:val="single" w:sz="4" w:space="6" w:color="B8863B"/>
+          <w:left w:val="single" w:sz="10" w:space="6" w:color="B8863B"/>
+          <w:right w:val="single" w:sz="4" w:space="6" w:color="B8863B"/>
+        </w:pBdr>
+      </w:pPr>
+      <w:r>
+        <w:rPr>
+          <w:b/>
+          <w:color w:val="B8863B"/>
+          <w:sz w:val="21"/>
+        </w:rPr>
+        <w:t xml:space="preserve">★ MILESTONE  —  </w:t>
+      </w:r>
+      <w:r>
+        <w:rPr>
+          <w:b/>
+          <w:color w:val="071A2F"/>
+          <w:sz w:val="21"/>
+        </w:rPr>
+        <w:t>~63MB of tracked repository leakage (roughly 30% of the repo's total size) is now excluded from the public GitHub Pages deploy -- fully preserved in git history, zero data loss, zero production impact, zero design changes. This is the first structural repo-hygiene milestone in the project: the live site now serves only what it actually uses.</w:t>
+      </w:r>
+    </w:p>
+    <w:p>
+      <w:pPr>
+        <w:spacing w:before="80" w:after="80"/>
+        <w:pBdr>
+          <w:bottom w:val="single" w:sz="6" w:space="1" w:color="B8863B"/>
+        </w:pBdr>
+      </w:pPr>
+    </w:p>
+    <w:p>
+      <w:pPr>
         <w:spacing w:before="320"/>
       </w:pPr>
       <w:r>

</xml_diff>

<commit_message>
Add Implementation 03 to master Project Prompt log + milestone highlight
Logs Prompt 03 (architecture guardrail) verbatim with its outcome, and
adds a highlighted milestone callout: the project now has a standing
guardrail document covering all 14 core systems built so far.

Co-Authored-By: Claude Sonnet 5 <noreply@anthropic.com>
Claude-Session: https://claude.ai/code/session_01NXemYjiiKgcxUzQN7iGVyh
</commit_message>
<xml_diff>
--- a/docs/FINTECHOSIS_Master_Project_Prompts.docx
+++ b/docs/FINTECHOSIS_Master_Project_Prompts.docx
@@ -1250,6 +1250,381 @@
           <w:sz w:val="21"/>
         </w:rPr>
         <w:t>~63MB of tracked repository leakage (roughly 30% of the repo's total size) is now excluded from the public GitHub Pages deploy -- fully preserved in git history, zero data loss, zero production impact, zero design changes. This is the first structural repo-hygiene milestone in the project: the live site now serves only what it actually uses.</w:t>
+      </w:r>
+    </w:p>
+    <w:p>
+      <w:pPr>
+        <w:spacing w:before="80" w:after="80"/>
+        <w:pBdr>
+          <w:bottom w:val="single" w:sz="6" w:space="1" w:color="B8863B"/>
+        </w:pBdr>
+      </w:pPr>
+    </w:p>
+    <w:p>
+      <w:pPr>
+        <w:spacing w:before="280" w:after="40"/>
+      </w:pPr>
+      <w:r>
+        <w:rPr>
+          <w:b/>
+          <w:color w:val="071A2F"/>
+          <w:sz w:val="30"/>
+        </w:rPr>
+        <w:t>4.  Implementation 03 -- Architecture Guardrail</w:t>
+      </w:r>
+    </w:p>
+    <w:p>
+      <w:pPr>
+        <w:spacing w:after="200"/>
+      </w:pPr>
+      <w:r>
+        <w:rPr>
+          <w:i/>
+          <w:color w:val="555F70"/>
+          <w:sz w:val="19"/>
+        </w:rPr>
+        <w:t>Date: 22 August 2026    |    Status: Completed and pushed (commit 1b80455)</w:t>
+      </w:r>
+    </w:p>
+    <w:p>
+      <w:pPr>
+        <w:spacing w:after="80"/>
+      </w:pPr>
+      <w:r>
+        <w:rPr>
+          <w:b/>
+          <w:color w:val="B8863B"/>
+          <w:sz w:val="20"/>
+        </w:rPr>
+        <w:t>PROMPT (verbatim)</w:t>
+      </w:r>
+    </w:p>
+    <w:p>
+      <w:pPr>
+        <w:spacing w:after="80"/>
+        <w:ind w:left="360"/>
+      </w:pPr>
+      <w:r>
+        <w:rPr>
+          <w:rFonts w:ascii="Consolas" w:hAnsi="Consolas"/>
+          <w:sz w:val="20"/>
+        </w:rPr>
+        <w:t>PROMPT 03 -- CREATE THE "FINTECHOSIS ARCHITECTURE GUARDRAIL"</w:t>
+      </w:r>
+    </w:p>
+    <w:p>
+      <w:pPr>
+        <w:spacing w:after="80"/>
+        <w:ind w:left="360"/>
+      </w:pPr>
+      <w:r>
+        <w:rPr>
+          <w:rFonts w:ascii="Consolas" w:hAnsi="Consolas"/>
+          <w:sz w:val="20"/>
+        </w:rPr>
+        <w:t>FINTECHOSIS -- IMPLEMENTATION 03</w:t>
+      </w:r>
+    </w:p>
+    <w:p>
+      <w:pPr>
+        <w:spacing w:after="80"/>
+        <w:ind w:left="360"/>
+      </w:pPr>
+      <w:r>
+        <w:rPr>
+          <w:rFonts w:ascii="Consolas" w:hAnsi="Consolas"/>
+          <w:sz w:val="20"/>
+        </w:rPr>
+        <w:t>ARCHITECTURE GUARDRAIL</w:t>
+      </w:r>
+    </w:p>
+    <w:p>
+      <w:pPr>
+        <w:spacing w:after="80"/>
+        <w:ind w:left="360"/>
+      </w:pPr>
+      <w:r>
+        <w:rPr>
+          <w:rFonts w:ascii="Consolas" w:hAnsi="Consolas"/>
+          <w:sz w:val="20"/>
+        </w:rPr>
+      </w:r>
+    </w:p>
+    <w:p>
+      <w:pPr>
+        <w:spacing w:after="80"/>
+        <w:ind w:left="360"/>
+      </w:pPr>
+      <w:r>
+        <w:rPr>
+          <w:rFonts w:ascii="Consolas" w:hAnsi="Consolas"/>
+          <w:sz w:val="20"/>
+        </w:rPr>
+        <w:t>Create a lightweight architecture-governance document for the Fintechosis repository. Do not change the website.</w:t>
+      </w:r>
+    </w:p>
+    <w:p>
+      <w:pPr>
+        <w:spacing w:after="80"/>
+        <w:ind w:left="360"/>
+      </w:pPr>
+      <w:r>
+        <w:rPr>
+          <w:rFonts w:ascii="Consolas" w:hAnsi="Consolas"/>
+          <w:sz w:val="20"/>
+        </w:rPr>
+      </w:r>
+    </w:p>
+    <w:p>
+      <w:pPr>
+        <w:spacing w:after="80"/>
+        <w:ind w:left="360"/>
+      </w:pPr>
+      <w:r>
+        <w:rPr>
+          <w:rFonts w:ascii="Consolas" w:hAnsi="Consolas"/>
+          <w:sz w:val="20"/>
+        </w:rPr>
+        <w:t>Document the components that are considered CORE and must not be replaced without explicit architectural approval.</w:t>
+      </w:r>
+    </w:p>
+    <w:p>
+      <w:pPr>
+        <w:spacing w:after="80"/>
+        <w:ind w:left="360"/>
+      </w:pPr>
+      <w:r>
+        <w:rPr>
+          <w:rFonts w:ascii="Consolas" w:hAnsi="Consolas"/>
+          <w:sz w:val="20"/>
+        </w:rPr>
+      </w:r>
+    </w:p>
+    <w:p>
+      <w:pPr>
+        <w:spacing w:after="80"/>
+        <w:ind w:left="360"/>
+      </w:pPr>
+      <w:r>
+        <w:rPr>
+          <w:rFonts w:ascii="Consolas" w:hAnsi="Consolas"/>
+          <w:sz w:val="20"/>
+        </w:rPr>
+        <w:t>CORE COMPONENTS INCLUDE: existing static HTML architecture; existing CSS architecture; existing JavaScript architecture; GPIR performance-tier system; reduced-motion implementation; existing mega-menu architecture after remediation; ticker architecture; search-index architecture; i18n dictionary architecture; dashboard gallery/lightbox; intelligence-page generator; sitemap structure; current country-page approach; responsive image approach.</w:t>
+      </w:r>
+    </w:p>
+    <w:p>
+      <w:pPr>
+        <w:spacing w:after="80"/>
+        <w:ind w:left="360"/>
+      </w:pPr>
+      <w:r>
+        <w:rPr>
+          <w:rFonts w:ascii="Consolas" w:hAnsi="Consolas"/>
+          <w:sz w:val="20"/>
+        </w:rPr>
+      </w:r>
+    </w:p>
+    <w:p>
+      <w:pPr>
+        <w:spacing w:after="80"/>
+        <w:ind w:left="360"/>
+      </w:pPr>
+      <w:r>
+        <w:rPr>
+          <w:rFonts w:ascii="Consolas" w:hAnsi="Consolas"/>
+          <w:sz w:val="20"/>
+        </w:rPr>
+        <w:t>Document: 1) What each system does, 2) Where it lives, 3) What depends on it, 4) How future developers should extend it, 5) What must not be duplicated, 6) What should eventually become data-driven, 7) What is explicitly deferred.</w:t>
+      </w:r>
+    </w:p>
+    <w:p>
+      <w:pPr>
+        <w:spacing w:after="80"/>
+        <w:ind w:left="360"/>
+      </w:pPr>
+      <w:r>
+        <w:rPr>
+          <w:rFonts w:ascii="Consolas" w:hAnsi="Consolas"/>
+          <w:sz w:val="20"/>
+        </w:rPr>
+      </w:r>
+    </w:p>
+    <w:p>
+      <w:pPr>
+        <w:spacing w:after="80"/>
+        <w:ind w:left="360"/>
+      </w:pPr>
+      <w:r>
+        <w:rPr>
+          <w:rFonts w:ascii="Consolas" w:hAnsi="Consolas"/>
+          <w:sz w:val="20"/>
+        </w:rPr>
+        <w:t>Add a CONTRIBUTING/ARCHITECTURE document if appropriate for the existing repository.</w:t>
+      </w:r>
+    </w:p>
+    <w:p>
+      <w:pPr>
+        <w:spacing w:after="80"/>
+        <w:ind w:left="360"/>
+      </w:pPr>
+      <w:r>
+        <w:rPr>
+          <w:rFonts w:ascii="Consolas" w:hAnsi="Consolas"/>
+          <w:sz w:val="20"/>
+        </w:rPr>
+      </w:r>
+    </w:p>
+    <w:p>
+      <w:pPr>
+        <w:spacing w:after="80"/>
+        <w:ind w:left="360"/>
+      </w:pPr>
+      <w:r>
+        <w:rPr>
+          <w:rFonts w:ascii="Consolas" w:hAnsi="Consolas"/>
+          <w:sz w:val="20"/>
+        </w:rPr>
+        <w:t>The purpose is to prevent future coding agents or developers from replacing functioning architecture unnecessarily.</w:t>
+      </w:r>
+    </w:p>
+    <w:p>
+      <w:pPr>
+        <w:spacing w:after="80"/>
+        <w:ind w:left="360"/>
+      </w:pPr>
+      <w:r>
+        <w:rPr>
+          <w:rFonts w:ascii="Consolas" w:hAnsi="Consolas"/>
+          <w:sz w:val="20"/>
+        </w:rPr>
+      </w:r>
+    </w:p>
+    <w:p>
+      <w:pPr>
+        <w:spacing w:after="80"/>
+        <w:ind w:left="360"/>
+      </w:pPr>
+      <w:r>
+        <w:rPr>
+          <w:rFonts w:ascii="Consolas" w:hAnsi="Consolas"/>
+          <w:sz w:val="20"/>
+        </w:rPr>
+        <w:t>Do not change production behaviour.</w:t>
+      </w:r>
+    </w:p>
+    <w:p>
+      <w:pPr>
+        <w:spacing w:before="200" w:after="80"/>
+      </w:pPr>
+      <w:r>
+        <w:rPr>
+          <w:b/>
+          <w:color w:val="B8863B"/>
+          <w:sz w:val="20"/>
+        </w:rPr>
+        <w:t>OUTCOME</w:t>
+      </w:r>
+    </w:p>
+    <w:p>
+      <w:pPr>
+        <w:pStyle w:val="ListBullet"/>
+        <w:ind w:left="360"/>
+      </w:pPr>
+      <w:r>
+        <w:rPr>
+          <w:sz w:val="20"/>
+        </w:rPr>
+        <w:t>Reviewed the two existing deep-dive docs first (ARCHITECTURE.md covers content/data/i18n layering, PERFORMANCE_ARCHITECTURE.md covers the performance-tier engine, responsive images, animation budget, ticker governance) to avoid duplicating what already exists -- the new document is a governance/index layer that points to those for systems already documented in depth, and covers the systems that weren't: the mega-menu, the ticker as a UI system, the search index, the dashboard gallery/lightbox, the intelligence-page generator, sitemap structure, the country-page approach, and the raw HTML/CSS/JS architecture itself.</w:t>
+      </w:r>
+    </w:p>
+    <w:p>
+      <w:pPr>
+        <w:pStyle w:val="ListBullet"/>
+        <w:ind w:left="360"/>
+      </w:pPr>
+      <w:r>
+        <w:rPr>
+          <w:sz w:val="20"/>
+        </w:rPr>
+        <w:t>Investigated each of the 14 named components directly (file reads, targeted greps) rather than writing from memory -- surfaced several concrete, non-obvious facts: CSS loading is NOT scoped per page (nearly every page loads the same ~26-file stack, unlike JS which is properly scoped), search-index.json has no generator script and is hand-maintained (a page added without a matching index entry fails silently, invisible to search with no error), sitemap.xml is a hybrid (hand-maintained except the pages/intelligence/* block, which the generator owns and overwrites), and world-map-countries.json is an explicitly curated marker subset, not the authoritative country list -- the six per-region registries are.</w:t>
+      </w:r>
+    </w:p>
+    <w:p>
+      <w:pPr>
+        <w:pStyle w:val="ListBullet"/>
+        <w:ind w:left="360"/>
+      </w:pPr>
+      <w:r>
+        <w:rPr>
+          <w:sz w:val="20"/>
+        </w:rPr>
+        <w:t>Wrote docs/ARCHITECTURE_GUARDRAIL.md covering all 14 components against the 7 required sub-points each, including an explicit guardrail against reverting the Implementation 01 mega-menu fix back to a transform-based centering approach, with the reasoning restated so a future agent can't rediscover the bug the hard way.</w:t>
+      </w:r>
+    </w:p>
+    <w:p>
+      <w:pPr>
+        <w:pStyle w:val="ListBullet"/>
+        <w:ind w:left="360"/>
+      </w:pPr>
+      <w:r>
+        <w:rPr>
+          <w:sz w:val="20"/>
+        </w:rPr>
+        <w:t>Populated the previously-empty docs/CONTRIBUTING.md with a short pointer into the guardrail doc plus the two pre-commit checks already available in the repo.</w:t>
+      </w:r>
+    </w:p>
+    <w:p>
+      <w:pPr>
+        <w:pStyle w:val="ListBullet"/>
+        <w:ind w:left="360"/>
+      </w:pPr>
+      <w:r>
+        <w:rPr>
+          <w:sz w:val="20"/>
+        </w:rPr>
+        <w:t>Docs-only change -- zero code, content, or production behaviour touched.</w:t>
+      </w:r>
+    </w:p>
+    <w:p>
+      <w:pPr>
+        <w:pStyle w:val="ListBullet"/>
+        <w:ind w:left="360"/>
+      </w:pPr>
+      <w:r>
+        <w:rPr>
+          <w:sz w:val="20"/>
+        </w:rPr>
+        <w:t>Committed and pushed to claude/website-ui-ux-design-d87as5 (commit 1b80455).</w:t>
+      </w:r>
+    </w:p>
+    <w:p>
+      <w:pPr>
+        <w:spacing w:before="200" w:after="200"/>
+        <w:ind w:left="216" w:right="216"/>
+        <w:shd w:val="clear" w:color="auto" w:fill="FBF3E6"/>
+        <w:pBdr>
+          <w:top w:val="single" w:sz="4" w:space="6" w:color="B8863B"/>
+          <w:bottom w:val="single" w:sz="4" w:space="6" w:color="B8863B"/>
+          <w:left w:val="single" w:sz="10" w:space="6" w:color="B8863B"/>
+          <w:right w:val="single" w:sz="4" w:space="6" w:color="B8863B"/>
+        </w:pBdr>
+      </w:pPr>
+      <w:r>
+        <w:rPr>
+          <w:b/>
+          <w:color w:val="B8863B"/>
+          <w:sz w:val="21"/>
+        </w:rPr>
+        <w:t xml:space="preserve">★ MILESTONE  —  </w:t>
+      </w:r>
+      <w:r>
+        <w:rPr>
+          <w:b/>
+          <w:color w:val="071A2F"/>
+          <w:sz w:val="21"/>
+        </w:rPr>
+        <w:t>The project now has a standing architecture guardrail (docs/ARCHITECTURE_GUARDRAIL.md) covering all 14 core systems built across this project's sprints. This is the governance milestone that makes every prior sprint's work durable: a future coding agent -- human or AI -- now has a single document telling it what must not be casually rebuilt, and why.</w:t>
       </w:r>
     </w:p>
     <w:p>

</xml_diff>

<commit_message>
Add Implementation 04 to master Project Prompt log + milestone highlight
Logs Prompt 04 (progressive content structuring) verbatim with its
outcome, and adds a highlighted milestone callout: the project's first
structured-content objects exist and are proven compatible with the live
architecture, without touching a single production file.

Co-Authored-By: Claude Sonnet 5 <noreply@anthropic.com>
Claude-Session: https://claude.ai/code/session_01NXemYjiiKgcxUzQN7iGVyh
</commit_message>
<xml_diff>
--- a/docs/FINTECHOSIS_Master_Project_Prompts.docx
+++ b/docs/FINTECHOSIS_Master_Project_Prompts.docx
@@ -1625,6 +1625,380 @@
           <w:sz w:val="21"/>
         </w:rPr>
         <w:t>The project now has a standing architecture guardrail (docs/ARCHITECTURE_GUARDRAIL.md) covering all 14 core systems built across this project's sprints. This is the governance milestone that makes every prior sprint's work durable: a future coding agent -- human or AI -- now has a single document telling it what must not be casually rebuilt, and why.</w:t>
+      </w:r>
+    </w:p>
+    <w:p>
+      <w:pPr>
+        <w:spacing w:before="80" w:after="80"/>
+        <w:pBdr>
+          <w:bottom w:val="single" w:sz="6" w:space="1" w:color="B8863B"/>
+        </w:pBdr>
+      </w:pPr>
+    </w:p>
+    <w:p>
+      <w:pPr>
+        <w:spacing w:before="280" w:after="40"/>
+      </w:pPr>
+      <w:r>
+        <w:rPr>
+          <w:b/>
+          <w:color w:val="071A2F"/>
+          <w:sz w:val="30"/>
+        </w:rPr>
+        <w:t>5.  Implementation 04 -- Progressive Content Structuring</w:t>
+      </w:r>
+    </w:p>
+    <w:p>
+      <w:pPr>
+        <w:spacing w:after="200"/>
+      </w:pPr>
+      <w:r>
+        <w:rPr>
+          <w:i/>
+          <w:color w:val="555F70"/>
+          <w:sz w:val="19"/>
+        </w:rPr>
+        <w:t>Date: 22 August 2026    |    Status: Completed and pushed (commit 4871a33)</w:t>
+      </w:r>
+    </w:p>
+    <w:p>
+      <w:pPr>
+        <w:spacing w:after="80"/>
+      </w:pPr>
+      <w:r>
+        <w:rPr>
+          <w:b/>
+          <w:color w:val="B8863B"/>
+          <w:sz w:val="20"/>
+        </w:rPr>
+        <w:t>PROMPT (verbatim)</w:t>
+      </w:r>
+    </w:p>
+    <w:p>
+      <w:pPr>
+        <w:spacing w:after="80"/>
+        <w:ind w:left="360"/>
+      </w:pPr>
+      <w:r>
+        <w:rPr>
+          <w:rFonts w:ascii="Consolas" w:hAnsi="Consolas"/>
+          <w:sz w:val="20"/>
+        </w:rPr>
+        <w:t>PROMPT 04 -- MOVE CONTENT TOWARD STRUCTURED CONTENT</w:t>
+      </w:r>
+    </w:p>
+    <w:p>
+      <w:pPr>
+        <w:spacing w:after="80"/>
+        <w:ind w:left="360"/>
+      </w:pPr>
+      <w:r>
+        <w:rPr>
+          <w:rFonts w:ascii="Consolas" w:hAnsi="Consolas"/>
+          <w:sz w:val="20"/>
+        </w:rPr>
+        <w:t>FINTECHOSIS -- IMPLEMENTATION 04</w:t>
+      </w:r>
+    </w:p>
+    <w:p>
+      <w:pPr>
+        <w:spacing w:after="80"/>
+        <w:ind w:left="360"/>
+      </w:pPr>
+      <w:r>
+        <w:rPr>
+          <w:rFonts w:ascii="Consolas" w:hAnsi="Consolas"/>
+          <w:sz w:val="20"/>
+        </w:rPr>
+        <w:t>PROGRESSIVE CONTENT STRUCTURING</w:t>
+      </w:r>
+    </w:p>
+    <w:p>
+      <w:pPr>
+        <w:spacing w:after="80"/>
+        <w:ind w:left="360"/>
+      </w:pPr>
+      <w:r>
+        <w:rPr>
+          <w:rFonts w:ascii="Consolas" w:hAnsi="Consolas"/>
+          <w:sz w:val="20"/>
+        </w:rPr>
+      </w:r>
+    </w:p>
+    <w:p>
+      <w:pPr>
+        <w:spacing w:after="80"/>
+        <w:ind w:left="360"/>
+      </w:pPr>
+      <w:r>
+        <w:rPr>
+          <w:rFonts w:ascii="Consolas" w:hAnsi="Consolas"/>
+          <w:sz w:val="20"/>
+        </w:rPr>
+        <w:t>The existing Fintechosis website contains valuable manually authored content. Do NOT rewrite or redesign existing content. Do NOT migrate the entire website in one operation.</w:t>
+      </w:r>
+    </w:p>
+    <w:p>
+      <w:pPr>
+        <w:spacing w:after="80"/>
+        <w:ind w:left="360"/>
+      </w:pPr>
+      <w:r>
+        <w:rPr>
+          <w:rFonts w:ascii="Consolas" w:hAnsi="Consolas"/>
+          <w:sz w:val="20"/>
+        </w:rPr>
+      </w:r>
+    </w:p>
+    <w:p>
+      <w:pPr>
+        <w:spacing w:after="80"/>
+        <w:ind w:left="360"/>
+      </w:pPr>
+      <w:r>
+        <w:rPr>
+          <w:rFonts w:ascii="Consolas" w:hAnsi="Consolas"/>
+          <w:sz w:val="20"/>
+        </w:rPr>
+        <w:t>Create a scalable structured-content model compatible with the existing static HTML/JSON/JavaScript architecture. The model must support: country, region, topic, payment rail, company/entity, corridor, regulation, research, intelligence, dataset, learning asset.</w:t>
+      </w:r>
+    </w:p>
+    <w:p>
+      <w:pPr>
+        <w:spacing w:after="80"/>
+        <w:ind w:left="360"/>
+      </w:pPr>
+      <w:r>
+        <w:rPr>
+          <w:rFonts w:ascii="Consolas" w:hAnsi="Consolas"/>
+          <w:sz w:val="20"/>
+        </w:rPr>
+      </w:r>
+    </w:p>
+    <w:p>
+      <w:pPr>
+        <w:spacing w:after="80"/>
+        <w:ind w:left="360"/>
+      </w:pPr>
+      <w:r>
+        <w:rPr>
+          <w:rFonts w:ascii="Consolas" w:hAnsi="Consolas"/>
+          <w:sz w:val="20"/>
+        </w:rPr>
+        <w:t>Each content object should support, where applicable: id, title, slug, summary, description, contentType, country, region, topic, subtopic, tags, publicationDate, lastUpdated, version, status, source, sourceUrl, relatedContent.</w:t>
+      </w:r>
+    </w:p>
+    <w:p>
+      <w:pPr>
+        <w:spacing w:after="80"/>
+        <w:ind w:left="360"/>
+      </w:pPr>
+      <w:r>
+        <w:rPr>
+          <w:rFonts w:ascii="Consolas" w:hAnsi="Consolas"/>
+          <w:sz w:val="20"/>
+        </w:rPr>
+      </w:r>
+    </w:p>
+    <w:p>
+      <w:pPr>
+        <w:spacing w:after="80"/>
+        <w:ind w:left="360"/>
+      </w:pPr>
+      <w:r>
+        <w:rPr>
+          <w:rFonts w:ascii="Consolas" w:hAnsi="Consolas"/>
+          <w:sz w:val="20"/>
+        </w:rPr>
+        <w:t>Do not introduce PostgreSQL or a knowledge graph yet. Use the simplest architecture compatible with the current GitHub/static-site model.</w:t>
+      </w:r>
+    </w:p>
+    <w:p>
+      <w:pPr>
+        <w:spacing w:after="80"/>
+        <w:ind w:left="360"/>
+      </w:pPr>
+      <w:r>
+        <w:rPr>
+          <w:rFonts w:ascii="Consolas" w:hAnsi="Consolas"/>
+          <w:sz w:val="20"/>
+        </w:rPr>
+      </w:r>
+    </w:p>
+    <w:p>
+      <w:pPr>
+        <w:spacing w:after="80"/>
+        <w:ind w:left="360"/>
+      </w:pPr>
+      <w:r>
+        <w:rPr>
+          <w:rFonts w:ascii="Consolas" w:hAnsi="Consolas"/>
+          <w:sz w:val="20"/>
+        </w:rPr>
+        <w:t>Migrate only ONE representative country and ONE representative research/intelligence object first. The existing page output must remain visually/functionally equivalent. The objective is to prove that structured content can feed the existing page architecture without disturbing the existing design.</w:t>
+      </w:r>
+    </w:p>
+    <w:p>
+      <w:pPr>
+        <w:spacing w:after="80"/>
+        <w:ind w:left="360"/>
+      </w:pPr>
+      <w:r>
+        <w:rPr>
+          <w:rFonts w:ascii="Consolas" w:hAnsi="Consolas"/>
+          <w:sz w:val="20"/>
+        </w:rPr>
+      </w:r>
+    </w:p>
+    <w:p>
+      <w:pPr>
+        <w:spacing w:after="80"/>
+        <w:ind w:left="360"/>
+      </w:pPr>
+      <w:r>
+        <w:rPr>
+          <w:rFonts w:ascii="Consolas" w:hAnsi="Consolas"/>
+          <w:sz w:val="20"/>
+        </w:rPr>
+        <w:t>At completion report: schema, sample content objects, rendering path, existing components reused, files changed, migration implications. An addition to masters and apply the changes as advised in prompt.</w:t>
+      </w:r>
+    </w:p>
+    <w:p>
+      <w:pPr>
+        <w:spacing w:before="200" w:after="80"/>
+      </w:pPr>
+      <w:r>
+        <w:rPr>
+          <w:b/>
+          <w:color w:val="B8863B"/>
+          <w:sz w:val="20"/>
+        </w:rPr>
+        <w:t>OUTCOME</w:t>
+      </w:r>
+    </w:p>
+    <w:p>
+      <w:pPr>
+        <w:pStyle w:val="ListBullet"/>
+        <w:ind w:left="360"/>
+      </w:pPr>
+      <w:r>
+        <w:rPr>
+          <w:sz w:val="20"/>
+        </w:rPr>
+        <w:t>Designed a common envelope (the prompt's field list) plus a per-type "typeSpecific" payload, covering all 11 content types -- plain JSON, no database, no knowledge graph, matching the site's existing announcements.json pattern of separating common fields from type-specific ones rather than inventing something new.</w:t>
+      </w:r>
+    </w:p>
+    <w:p>
+      <w:pPr>
+        <w:pStyle w:val="ListBullet"/>
+        <w:ind w:left="360"/>
+      </w:pPr>
+      <w:r>
+        <w:rPr>
+          <w:sz w:val="20"/>
+        </w:rPr>
+        <w:t>Investigated the real rendering paths before assuming any: confirmed the interactive world map (assets/js/world-map.js) is the one country-related system that already reads JSON at runtime -- the region-directory pages and mega-menu country columns turned out to be hand-authored static HTML, not data-driven, so the country pilot's proof targets the world map specifically rather than a system that doesn't actually exist.</w:t>
+      </w:r>
+    </w:p>
+    <w:p>
+      <w:pPr>
+        <w:pStyle w:val="ListBullet"/>
+        <w:ind w:left="360"/>
+      </w:pPr>
+      <w:r>
+        <w:rPr>
+          <w:sz w:val="20"/>
+        </w:rPr>
+        <w:t>Created two real content objects -- assets/data/content/countries/uae.json and assets/data/content/intelligence/cbuae-payment-token-2026.json -- built from the live middle-east-countries.json, world-map-countries.json, and announcements.json data, nothing fabricated.</w:t>
+      </w:r>
+    </w:p>
+    <w:p>
+      <w:pPr>
+        <w:pStyle w:val="ListBullet"/>
+        <w:ind w:left="360"/>
+      </w:pPr>
+      <w:r>
+        <w:rPr>
+          <w:sz w:val="20"/>
+        </w:rPr>
+        <w:t>Built scripts/content-object-adapter.js (pure conversion functions back into the exact shapes the existing renderers already expect) and proved both conversions are field-for-field identical to the live data.</w:t>
+      </w:r>
+    </w:p>
+    <w:p>
+      <w:pPr>
+        <w:pStyle w:val="ListBullet"/>
+        <w:ind w:left="360"/>
+      </w:pPr>
+      <w:r>
+        <w:rPr>
+          <w:sz w:val="20"/>
+        </w:rPr>
+        <w:t>Went further than a data-equality check for the intelligence pilot: ran an isolated regeneration (a scratch copy of generate-intelligence-pages.js, scratch paths, the adapter-derived record substituted for the real one, every other record untouched) and diffed the output against the live page -- byte-for-byte identical, zero difference.</w:t>
+      </w:r>
+    </w:p>
+    <w:p>
+      <w:pPr>
+        <w:pStyle w:val="ListBullet"/>
+        <w:ind w:left="360"/>
+      </w:pPr>
+      <w:r>
+        <w:rPr>
+          <w:sz w:val="20"/>
+        </w:rPr>
+        <w:t>Zero production files touched -- world-map.js, generate-intelligence-pages.js, announcements.json, and both country registries are all untouched; every new file is additive and nothing is wired into a live page yet, per "prove... without disturbing the existing design" and "do NOT migrate the entire website in one operation."</w:t>
+      </w:r>
+    </w:p>
+    <w:p>
+      <w:pPr>
+        <w:pStyle w:val="ListBullet"/>
+        <w:ind w:left="360"/>
+      </w:pPr>
+      <w:r>
+        <w:rPr>
+          <w:sz w:val="20"/>
+        </w:rPr>
+        <w:t>Documented in docs/CONTENT_SCHEMA.md exactly what would need to happen, per content type, before this becomes the live source of truth -- explicitly scoped as a later, separate decision, not part of this pass.</w:t>
+      </w:r>
+    </w:p>
+    <w:p>
+      <w:pPr>
+        <w:pStyle w:val="ListBullet"/>
+        <w:ind w:left="360"/>
+      </w:pPr>
+      <w:r>
+        <w:rPr>
+          <w:sz w:val="20"/>
+        </w:rPr>
+        <w:t>Committed and pushed to claude/website-ui-ux-design-d87as5 (commit 4871a33).</w:t>
+      </w:r>
+    </w:p>
+    <w:p>
+      <w:pPr>
+        <w:spacing w:before="200" w:after="200"/>
+        <w:ind w:left="216" w:right="216"/>
+        <w:shd w:val="clear" w:color="auto" w:fill="FBF3E6"/>
+        <w:pBdr>
+          <w:top w:val="single" w:sz="4" w:space="6" w:color="B8863B"/>
+          <w:bottom w:val="single" w:sz="4" w:space="6" w:color="B8863B"/>
+          <w:left w:val="single" w:sz="10" w:space="6" w:color="B8863B"/>
+          <w:right w:val="single" w:sz="4" w:space="6" w:color="B8863B"/>
+        </w:pBdr>
+      </w:pPr>
+      <w:r>
+        <w:rPr>
+          <w:b/>
+          <w:color w:val="B8863B"/>
+          <w:sz w:val="21"/>
+        </w:rPr>
+        <w:t xml:space="preserve">★ MILESTONE  —  </w:t>
+      </w:r>
+      <w:r>
+        <w:rPr>
+          <w:b/>
+          <w:color w:val="071A2F"/>
+          <w:sz w:val="21"/>
+        </w:rPr>
+        <w:t>The project's first structured-content objects now exist and are proven compatible with the live architecture: a unified 11-type schema, one real country object and one real intelligence object, and byte-for-byte verified rendering-path equivalence -- all without touching a single production file. This is the foundation Prompt 05+ would build on to actually migrate content, not the migration itself.</w:t>
       </w:r>
     </w:p>
     <w:p>

</xml_diff>

<commit_message>
Add Implementation 05 to master Project Prompt log + milestone highlight
Logs Prompt 05 (content relationship model) verbatim with its outcome,
and adds a highlighted milestone callout: a real, checkable relationship
graph now sits on top of the structured-content foundation, with a
generated reverse index proving reuse without duplication.

Co-Authored-By: Claude Sonnet 5 <noreply@anthropic.com>
Claude-Session: https://claude.ai/code/session_01NXemYjiiKgcxUzQN7iGVyh
</commit_message>
<xml_diff>
--- a/docs/FINTECHOSIS_Master_Project_Prompts.docx
+++ b/docs/FINTECHOSIS_Master_Project_Prompts.docx
@@ -1999,6 +1999,293 @@
           <w:sz w:val="21"/>
         </w:rPr>
         <w:t>The project's first structured-content objects now exist and are proven compatible with the live architecture: a unified 11-type schema, one real country object and one real intelligence object, and byte-for-byte verified rendering-path equivalence -- all without touching a single production file. This is the foundation Prompt 05+ would build on to actually migrate content, not the migration itself.</w:t>
+      </w:r>
+    </w:p>
+    <w:p>
+      <w:pPr>
+        <w:spacing w:before="80" w:after="80"/>
+        <w:pBdr>
+          <w:bottom w:val="single" w:sz="6" w:space="1" w:color="B8863B"/>
+        </w:pBdr>
+      </w:pPr>
+    </w:p>
+    <w:p>
+      <w:pPr>
+        <w:spacing w:before="280" w:after="40"/>
+      </w:pPr>
+      <w:r>
+        <w:rPr>
+          <w:b/>
+          <w:color w:val="071A2F"/>
+          <w:sz w:val="30"/>
+        </w:rPr>
+        <w:t>6.  Implementation 05 -- Content Relationship Model</w:t>
+      </w:r>
+    </w:p>
+    <w:p>
+      <w:pPr>
+        <w:spacing w:after="200"/>
+      </w:pPr>
+      <w:r>
+        <w:rPr>
+          <w:i/>
+          <w:color w:val="555F70"/>
+          <w:sz w:val="19"/>
+        </w:rPr>
+        <w:t>Date: 22 August 2026    |    Status: Completed and pushed (commit 2458b2a)</w:t>
+      </w:r>
+    </w:p>
+    <w:p>
+      <w:pPr>
+        <w:spacing w:after="80"/>
+      </w:pPr>
+      <w:r>
+        <w:rPr>
+          <w:b/>
+          <w:color w:val="B8863B"/>
+          <w:sz w:val="20"/>
+        </w:rPr>
+        <w:t>PROMPT (verbatim)</w:t>
+      </w:r>
+    </w:p>
+    <w:p>
+      <w:pPr>
+        <w:spacing w:after="80"/>
+        <w:ind w:left="360"/>
+      </w:pPr>
+      <w:r>
+        <w:rPr>
+          <w:rFonts w:ascii="Consolas" w:hAnsi="Consolas"/>
+          <w:sz w:val="20"/>
+        </w:rPr>
+        <w:t>PROMPT 05 -- BUILD THE CONTENT RELATIONSHIP MODEL</w:t>
+      </w:r>
+    </w:p>
+    <w:p>
+      <w:pPr>
+        <w:spacing w:after="80"/>
+        <w:ind w:left="360"/>
+      </w:pPr>
+      <w:r>
+        <w:rPr>
+          <w:rFonts w:ascii="Consolas" w:hAnsi="Consolas"/>
+          <w:sz w:val="20"/>
+        </w:rPr>
+        <w:t>FINTECHOSIS -- IMPLEMENTATION 05</w:t>
+      </w:r>
+    </w:p>
+    <w:p>
+      <w:pPr>
+        <w:spacing w:after="80"/>
+        <w:ind w:left="360"/>
+      </w:pPr>
+      <w:r>
+        <w:rPr>
+          <w:rFonts w:ascii="Consolas" w:hAnsi="Consolas"/>
+          <w:sz w:val="20"/>
+        </w:rPr>
+        <w:t>CONTENT RELATIONSHIP MODEL</w:t>
+      </w:r>
+    </w:p>
+    <w:p>
+      <w:pPr>
+        <w:spacing w:after="80"/>
+        <w:ind w:left="360"/>
+      </w:pPr>
+      <w:r>
+        <w:rPr>
+          <w:rFonts w:ascii="Consolas" w:hAnsi="Consolas"/>
+          <w:sz w:val="20"/>
+        </w:rPr>
+      </w:r>
+    </w:p>
+    <w:p>
+      <w:pPr>
+        <w:spacing w:after="80"/>
+        <w:ind w:left="360"/>
+      </w:pPr>
+      <w:r>
+        <w:rPr>
+          <w:rFonts w:ascii="Consolas" w:hAnsi="Consolas"/>
+          <w:sz w:val="20"/>
+        </w:rPr>
+        <w:t>Example: Vietnam content can relate to Vietnam, APAC, RTP, remittances, B2B, Singapore, NAPAS, regulations, specific research.</w:t>
+      </w:r>
+    </w:p>
+    <w:p>
+      <w:pPr>
+        <w:spacing w:after="80"/>
+        <w:ind w:left="360"/>
+      </w:pPr>
+      <w:r>
+        <w:rPr>
+          <w:rFonts w:ascii="Consolas" w:hAnsi="Consolas"/>
+          <w:sz w:val="20"/>
+        </w:rPr>
+      </w:r>
+    </w:p>
+    <w:p>
+      <w:pPr>
+        <w:spacing w:after="80"/>
+        <w:ind w:left="360"/>
+      </w:pPr>
+      <w:r>
+        <w:rPr>
+          <w:rFonts w:ascii="Consolas" w:hAnsi="Consolas"/>
+          <w:sz w:val="20"/>
+        </w:rPr>
+        <w:t>Extend the structured-content model to support relationships between content objects. Support relationships such as: Country-&gt;Region, Country-&gt;Currency, Country-&gt;Payment Rail, Country-&gt;Company, Country-&gt;Regulator, Country-&gt;Corridor, Country-&gt;Research, Country-&gt;Regulation; Company-&gt;Country, Company-&gt;Payment Rail, Company-&gt;Corridor, Company-&gt;Research; Payment Rail-&gt;Country, Payment Rail-&gt;Region, Payment Rail-&gt;Company, Payment Rail-&gt;Corridor; Research-&gt;Country, Research-&gt;Topic, Research-&gt;Company, Research-&gt;Payment Rail, Research-&gt;Corridor; Regulation-&gt;Country, Regulation-&gt;Regulator, Regulation-&gt;Payment Rail, Regulation-&gt;Company.</w:t>
+      </w:r>
+    </w:p>
+    <w:p>
+      <w:pPr>
+        <w:spacing w:after="80"/>
+        <w:ind w:left="360"/>
+      </w:pPr>
+      <w:r>
+        <w:rPr>
+          <w:rFonts w:ascii="Consolas" w:hAnsi="Consolas"/>
+          <w:sz w:val="20"/>
+        </w:rPr>
+      </w:r>
+    </w:p>
+    <w:p>
+      <w:pPr>
+        <w:spacing w:after="80"/>
+        <w:ind w:left="360"/>
+      </w:pPr>
+      <w:r>
+        <w:rPr>
+          <w:rFonts w:ascii="Consolas" w:hAnsi="Consolas"/>
+          <w:sz w:val="20"/>
+        </w:rPr>
+        <w:t>Do not build a graph database. Implement relationships using the current content architecture. The same content object should be reusable in multiple contexts. For example, a Vietnam payment development should not need separate copies for Vietnam, APAC, RTP, B2B, and relevant corridor -- instead, establish relationships. Preserve all existing page output. For masters updating and execute the prompt.</w:t>
+      </w:r>
+    </w:p>
+    <w:p>
+      <w:pPr>
+        <w:spacing w:before="200" w:after="80"/>
+      </w:pPr>
+      <w:r>
+        <w:rPr>
+          <w:b/>
+          <w:color w:val="B8863B"/>
+          <w:sz w:val="20"/>
+        </w:rPr>
+        <w:t>OUTCOME</w:t>
+      </w:r>
+    </w:p>
+    <w:p>
+      <w:pPr>
+        <w:pStyle w:val="ListBullet"/>
+        <w:ind w:left="360"/>
+      </w:pPr>
+      <w:r>
+        <w:rPr>
+          <w:sz w:val="20"/>
+        </w:rPr>
+        <w:t>Extended the JSON Schema and content objects with a `relationships` array of typed edges (type/targetId/targetType), using the prompt's ~24-edge controlled vocabulary verbatim -- as an additive second layer alongside Implementation 04's relatedContent field, which stays unchanged so its already-verified adapter proof keeps holding.</w:t>
+      </w:r>
+    </w:p>
+    <w:p>
+      <w:pPr>
+        <w:pStyle w:val="ListBullet"/>
+        <w:ind w:left="360"/>
+      </w:pPr>
+      <w:r>
+        <w:rPr>
+          <w:sz w:val="20"/>
+        </w:rPr>
+        <w:t>Surfaced and documented two vocabulary gaps rather than silently working around them: the 11-type list from Implementation 04 has no "Currency" or "Regulator" content type, so Country-&gt;Currency is modeled as a country attribute (not an edge to an object) and "Regulator" is defined as an entity-role variant of the existing company/entity type.</w:t>
+      </w:r>
+    </w:p>
+    <w:p>
+      <w:pPr>
+        <w:pStyle w:val="ListBullet"/>
+        <w:ind w:left="360"/>
+      </w:pPr>
+      <w:r>
+        <w:rPr>
+          <w:sz w:val="20"/>
+        </w:rPr>
+        <w:t>Populated real relationships (Country-&gt;Region, -&gt;Regulator, -&gt;Regulation, -&gt;PaymentRail, -&gt;Research, Regulation-&gt;Country, -&gt;Regulator, Research-&gt;Country, -&gt;Topic, PaymentRail-&gt;Country, -&gt;Region -- 11 of the 24 listed types) by creating 5 new real, non-fabricated supporting objects sourced from already-live site content: a Middle East region object, a Central Bank of the UAE regulator entity (from the real trusted-sources.json registry), the CBUAE Payment Token Services Regulation as its own object distinct from the announcement about it, a Stablecoins &amp; CBDCs topic object, and an Aani/UAE Instant Payments Platform payment-rail object -- the last two confirmed real by checking that pages/countries/uae.html and pages/chapters/rtp-directory.html both already discuss Aani/RTP before creating the object, not assumed.</w:t>
+      </w:r>
+    </w:p>
+    <w:p>
+      <w:pPr>
+        <w:pStyle w:val="ListBullet"/>
+        <w:ind w:left="360"/>
+      </w:pPr>
+      <w:r>
+        <w:rPr>
+          <w:sz w:val="20"/>
+        </w:rPr>
+        <w:t>Documented the remaining 13 vocabulary entries (Company-&gt;*, PaymentRail-&gt;Company/Corridor, Research-&gt;Company/PaymentRail/Corridor, Regulation-&gt;PaymentRail/Company, Country-&gt;Company/Corridor) as vocabulary-defined but unpopulated -- no real Company, Corridor or Dataset object exists yet to relate to honestly, matching Implementation 04's standard for unpopulated content types.</w:t>
+      </w:r>
+    </w:p>
+    <w:p>
+      <w:pPr>
+        <w:pStyle w:val="ListBullet"/>
+        <w:ind w:left="360"/>
+      </w:pPr>
+      <w:r>
+        <w:rPr>
+          <w:sz w:val="20"/>
+        </w:rPr>
+        <w:t>Built scripts/generate-relationships-index.js -- scans every content object and generates (never hand-edits) relationships-index.json with each object's outbound and computed inbound edges. Concrete reusability proof from its own output: country-uae, entity-cbuae and region-middle-east are each referenced from multiple other objects with zero duplicated copies -- the exact property the prompt's Vietnam example asked to demonstrate.</w:t>
+      </w:r>
+    </w:p>
+    <w:p>
+      <w:pPr>
+        <w:pStyle w:val="ListBullet"/>
+        <w:ind w:left="360"/>
+      </w:pPr>
+      <w:r>
+        <w:rPr>
+          <w:sz w:val="20"/>
+        </w:rPr>
+        <w:t>Re-verified after every change that nothing existing moved: the adapter's two equivalence proofs (node scripts/content-object-adapter.js) and the byte-for-byte isolated intelligence-page regeneration diff both still pass unchanged. Zero production files touched.</w:t>
+      </w:r>
+    </w:p>
+    <w:p>
+      <w:pPr>
+        <w:pStyle w:val="ListBullet"/>
+        <w:ind w:left="360"/>
+      </w:pPr>
+      <w:r>
+        <w:rPr>
+          <w:sz w:val="20"/>
+        </w:rPr>
+        <w:t>Committed and pushed to claude/website-ui-ux-design-d87as5 (commit 2458b2a).</w:t>
+      </w:r>
+    </w:p>
+    <w:p>
+      <w:pPr>
+        <w:spacing w:before="200" w:after="200"/>
+        <w:ind w:left="216" w:right="216"/>
+        <w:shd w:val="clear" w:color="auto" w:fill="FBF3E6"/>
+        <w:pBdr>
+          <w:top w:val="single" w:sz="4" w:space="6" w:color="B8863B"/>
+          <w:bottom w:val="single" w:sz="4" w:space="6" w:color="B8863B"/>
+          <w:left w:val="single" w:sz="10" w:space="6" w:color="B8863B"/>
+          <w:right w:val="single" w:sz="4" w:space="6" w:color="B8863B"/>
+        </w:pBdr>
+      </w:pPr>
+      <w:r>
+        <w:rPr>
+          <w:b/>
+          <w:color w:val="B8863B"/>
+          <w:sz w:val="21"/>
+        </w:rPr>
+        <w:t xml:space="preserve">★ MILESTONE  —  </w:t>
+      </w:r>
+      <w:r>
+        <w:rPr>
+          <w:b/>
+          <w:color w:val="071A2F"/>
+          <w:sz w:val="21"/>
+        </w:rPr>
+        <w:t>The structured-content foundation now has a real, checkable relationship graph layered on top of it -- 7 content objects, 11 of 24 prompted relationship types populated with real data, and a generated reverse index that proves reuse without duplication in the exact way the prompt's own Vietnam example asked for. Still zero production files touched across two implementations in a row.</w:t>
       </w:r>
     </w:p>
     <w:p>

</xml_diff>

<commit_message>
Add Implementation 06 to master Project Prompt log + milestone highlight
Logs Prompt 06 (source, evidence and version foundation) verbatim with
its outcome, and adds a highlighted milestone callout: the site can now
distinguish verified fact from FINTECHOISIS analysis field-by-field,
with the classification itself held to the same evidence discipline as
the content it describes.

Co-Authored-By: Claude Sonnet 5 <noreply@anthropic.com>
Claude-Session: https://claude.ai/code/session_01NXemYjiiKgcxUzQN7iGVyh
</commit_message>
<xml_diff>
--- a/docs/FINTECHOSIS_Master_Project_Prompts.docx
+++ b/docs/FINTECHOSIS_Master_Project_Prompts.docx
@@ -2286,6 +2286,343 @@
           <w:sz w:val="21"/>
         </w:rPr>
         <w:t>The structured-content foundation now has a real, checkable relationship graph layered on top of it -- 7 content objects, 11 of 24 prompted relationship types populated with real data, and a generated reverse index that proves reuse without duplication in the exact way the prompt's own Vietnam example asked for. Still zero production files touched across two implementations in a row.</w:t>
+      </w:r>
+    </w:p>
+    <w:p>
+      <w:pPr>
+        <w:spacing w:before="80" w:after="80"/>
+        <w:pBdr>
+          <w:bottom w:val="single" w:sz="6" w:space="1" w:color="B8863B"/>
+        </w:pBdr>
+      </w:pPr>
+    </w:p>
+    <w:p>
+      <w:pPr>
+        <w:spacing w:before="280" w:after="40"/>
+      </w:pPr>
+      <w:r>
+        <w:rPr>
+          <w:b/>
+          <w:color w:val="071A2F"/>
+          <w:sz w:val="30"/>
+        </w:rPr>
+        <w:t>7.  Implementation 06 -- Source, Evidence and Version Foundation</w:t>
+      </w:r>
+    </w:p>
+    <w:p>
+      <w:pPr>
+        <w:spacing w:after="200"/>
+      </w:pPr>
+      <w:r>
+        <w:rPr>
+          <w:i/>
+          <w:color w:val="555F70"/>
+          <w:sz w:val="19"/>
+        </w:rPr>
+        <w:t>Date: 22 August 2026    |    Status: Completed and pushed (commit 37ca4d6)</w:t>
+      </w:r>
+    </w:p>
+    <w:p>
+      <w:pPr>
+        <w:spacing w:after="80"/>
+      </w:pPr>
+      <w:r>
+        <w:rPr>
+          <w:b/>
+          <w:color w:val="B8863B"/>
+          <w:sz w:val="20"/>
+        </w:rPr>
+        <w:t>PROMPT (verbatim)</w:t>
+      </w:r>
+    </w:p>
+    <w:p>
+      <w:pPr>
+        <w:spacing w:after="80"/>
+        <w:ind w:left="360"/>
+      </w:pPr>
+      <w:r>
+        <w:rPr>
+          <w:rFonts w:ascii="Consolas" w:hAnsi="Consolas"/>
+          <w:sz w:val="20"/>
+        </w:rPr>
+        <w:t>PROMPT 06 -- SOURCE + VERSION + EVIDENCE</w:t>
+      </w:r>
+    </w:p>
+    <w:p>
+      <w:pPr>
+        <w:spacing w:after="80"/>
+        <w:ind w:left="360"/>
+      </w:pPr>
+      <w:r>
+        <w:rPr>
+          <w:rFonts w:ascii="Consolas" w:hAnsi="Consolas"/>
+          <w:sz w:val="20"/>
+        </w:rPr>
+        <w:t>FINTECHOSIS -- IMPLEMENTATION 06</w:t>
+      </w:r>
+    </w:p>
+    <w:p>
+      <w:pPr>
+        <w:spacing w:after="80"/>
+        <w:ind w:left="360"/>
+      </w:pPr>
+      <w:r>
+        <w:rPr>
+          <w:rFonts w:ascii="Consolas" w:hAnsi="Consolas"/>
+          <w:sz w:val="20"/>
+        </w:rPr>
+        <w:t>SOURCE, EVIDENCE AND VERSION FOUNDATION</w:t>
+      </w:r>
+    </w:p>
+    <w:p>
+      <w:pPr>
+        <w:spacing w:after="80"/>
+        <w:ind w:left="360"/>
+      </w:pPr>
+      <w:r>
+        <w:rPr>
+          <w:rFonts w:ascii="Consolas" w:hAnsi="Consolas"/>
+          <w:sz w:val="20"/>
+        </w:rPr>
+      </w:r>
+    </w:p>
+    <w:p>
+      <w:pPr>
+        <w:spacing w:after="80"/>
+        <w:ind w:left="360"/>
+      </w:pPr>
+      <w:r>
+        <w:rPr>
+          <w:rFonts w:ascii="Consolas" w:hAnsi="Consolas"/>
+          <w:sz w:val="20"/>
+        </w:rPr>
+        <w:t>Extend the structured content model to support research provenance. For research-oriented information support: sourceName, sourceOrganisation, sourceType, sourceUrl, publicationDate, referencePeriod, retrievalDate, verificationStatus, lastReviewed, version.</w:t>
+      </w:r>
+    </w:p>
+    <w:p>
+      <w:pPr>
+        <w:spacing w:after="80"/>
+        <w:ind w:left="360"/>
+      </w:pPr>
+      <w:r>
+        <w:rPr>
+          <w:rFonts w:ascii="Consolas" w:hAnsi="Consolas"/>
+          <w:sz w:val="20"/>
+        </w:rPr>
+      </w:r>
+    </w:p>
+    <w:p>
+      <w:pPr>
+        <w:spacing w:after="80"/>
+        <w:ind w:left="360"/>
+      </w:pPr>
+      <w:r>
+        <w:rPr>
+          <w:rFonts w:ascii="Consolas" w:hAnsi="Consolas"/>
+          <w:sz w:val="20"/>
+        </w:rPr>
+        <w:t>Source types: PRIMARY, REGULATORY, MULTILATERAL, INDUSTRY, COMPANY, SECONDARY, OTHER. Also distinguish: FACT, DATA, ANALYSIS, ESTIMATE, FORECAST.</w:t>
+      </w:r>
+    </w:p>
+    <w:p>
+      <w:pPr>
+        <w:spacing w:after="80"/>
+        <w:ind w:left="360"/>
+      </w:pPr>
+      <w:r>
+        <w:rPr>
+          <w:rFonts w:ascii="Consolas" w:hAnsi="Consolas"/>
+          <w:sz w:val="20"/>
+        </w:rPr>
+      </w:r>
+    </w:p>
+    <w:p>
+      <w:pPr>
+        <w:spacing w:after="80"/>
+        <w:ind w:left="360"/>
+      </w:pPr>
+      <w:r>
+        <w:rPr>
+          <w:rFonts w:ascii="Consolas" w:hAnsi="Consolas"/>
+          <w:sz w:val="20"/>
+        </w:rPr>
+        <w:t>Do not automatically classify existing content if evidence is insufficient. Do not invent source information. Do not change factual content.</w:t>
+      </w:r>
+    </w:p>
+    <w:p>
+      <w:pPr>
+        <w:spacing w:after="80"/>
+        <w:ind w:left="360"/>
+      </w:pPr>
+      <w:r>
+        <w:rPr>
+          <w:rFonts w:ascii="Consolas" w:hAnsi="Consolas"/>
+          <w:sz w:val="20"/>
+        </w:rPr>
+      </w:r>
+    </w:p>
+    <w:p>
+      <w:pPr>
+        <w:spacing w:after="80"/>
+        <w:ind w:left="360"/>
+      </w:pPr>
+      <w:r>
+        <w:rPr>
+          <w:rFonts w:ascii="Consolas" w:hAnsi="Consolas"/>
+          <w:sz w:val="20"/>
+        </w:rPr>
+        <w:t>Create reusable source/evidence presentation components. Create lightweight version metadata. Git history remains the underlying development history; website-level version metadata is for content lifecycle and future intelligence processing.</w:t>
+      </w:r>
+    </w:p>
+    <w:p>
+      <w:pPr>
+        <w:spacing w:after="80"/>
+        <w:ind w:left="360"/>
+      </w:pPr>
+      <w:r>
+        <w:rPr>
+          <w:rFonts w:ascii="Consolas" w:hAnsi="Consolas"/>
+          <w:sz w:val="20"/>
+        </w:rPr>
+      </w:r>
+    </w:p>
+    <w:p>
+      <w:pPr>
+        <w:spacing w:after="80"/>
+        <w:ind w:left="360"/>
+      </w:pPr>
+      <w:r>
+        <w:rPr>
+          <w:rFonts w:ascii="Consolas" w:hAnsi="Consolas"/>
+          <w:sz w:val="20"/>
+        </w:rPr>
+        <w:t>The website should clearly distinguish factual source material from Fintechosis analysis without making the interface visually heavy. Preserve existing design.</w:t>
+      </w:r>
+    </w:p>
+    <w:p>
+      <w:pPr>
+        <w:spacing w:before="200" w:after="80"/>
+      </w:pPr>
+      <w:r>
+        <w:rPr>
+          <w:b/>
+          <w:color w:val="B8863B"/>
+          <w:sz w:val="20"/>
+        </w:rPr>
+        <w:t>OUTCOME</w:t>
+      </w:r>
+    </w:p>
+    <w:p>
+      <w:pPr>
+        <w:pStyle w:val="ListBullet"/>
+        <w:ind w:left="360"/>
+      </w:pPr>
+      <w:r>
+        <w:rPr>
+          <w:sz w:val="20"/>
+        </w:rPr>
+        <w:t>Extended the schema with two optional envelope objects: `evidence` (the prompt's provenance fields plus the two enums) and `versionInfo` ({supersedes, supersededBy}) -- both null/empty by default, additive alongside the existing Implementation 04/05 fields rather than duplicating sourceUrl/publicationDate/version, which already existed at the envelope's top level.</w:t>
+      </w:r>
+    </w:p>
+    <w:p>
+      <w:pPr>
+        <w:pStyle w:val="ListBullet"/>
+        <w:ind w:left="360"/>
+      </w:pPr>
+      <w:r>
+        <w:rPr>
+          <w:sz w:val="20"/>
+        </w:rPr>
+        <w:t>verificationStatus deliberately reuses the site's existing trust-engine vocabulary (SOURCE_VERIFIED/SOURCE_WARNING/SOURCE_REQUIRES_VERIFICATION/SOURCE_BLOCKED) rather than inventing a competing one -- a direct application of the architecture guardrail's "must not be duplicated" rule from Implementation 03.</w:t>
+      </w:r>
+    </w:p>
+    <w:p>
+      <w:pPr>
+        <w:pStyle w:val="ListBullet"/>
+        <w:ind w:left="360"/>
+      </w:pPr>
+      <w:r>
+        <w:rPr>
+          <w:sz w:val="20"/>
+        </w:rPr>
+        <w:t>"Do not automatically classify existing content if evidence is insufficient" applied literally: of the 7 content objects that exist, exactly 3 (sharing the same real, tier-1 CBUAE source) got a populated evidence block, with verificationStatus cited from the real generator's own already-computed output rather than re-derived. The other 4 were left unclassified with documented reasons -- no captured external primary source existed for them, and inventing one would have violated "do not invent source information."</w:t>
+      </w:r>
+    </w:p>
+    <w:p>
+      <w:pPr>
+        <w:pStyle w:val="ListBullet"/>
+        <w:ind w:left="360"/>
+      </w:pPr>
+      <w:r>
+        <w:rPr>
+          <w:sz w:val="20"/>
+        </w:rPr>
+        <w:t>Surfaced a genuine nuance while classifying the intelligence pilot object: its summary is sourced fact but its description is FINTECHOISIS's own interpretive commentary -- added `analysisFields` to flag this at the field level rather than forcing a second content object to exist for one sentence of analysis.</w:t>
+      </w:r>
+    </w:p>
+    <w:p>
+      <w:pPr>
+        <w:pStyle w:val="ListBullet"/>
+        <w:ind w:left="360"/>
+      </w:pPr>
+      <w:r>
+        <w:rPr>
+          <w:sz w:val="20"/>
+        </w:rPr>
+        <w:t>Built a small, reusable presentation component (source-evidence-badge.css/.js) -- a compact pill plus an optional "FINTECHOISIS Analysis" note, styled entirely from existing design tokens, no new colours or type scale. Proved it with real data at _demo/source-evidence-badge-demo.html (excluded from the live build by the same underscore-prefix convention Implementation 02 established) -- Playwright-verified and screenshotted: all 3 evidence blocks and the 1 expected analysis note render correctly, visibly lightweight rather than heavy.</w:t>
+      </w:r>
+    </w:p>
+    <w:p>
+      <w:pPr>
+        <w:pStyle w:val="ListBullet"/>
+        <w:ind w:left="360"/>
+      </w:pPr>
+      <w:r>
+        <w:rPr>
+          <w:sz w:val="20"/>
+        </w:rPr>
+        <w:t>Re-verified after every change that nothing existing moved: both adapter proofs and the byte-for-byte intelligence-page regeneration diff still pass. Zero production files touched, zero factual content changed, three implementations running.</w:t>
+      </w:r>
+    </w:p>
+    <w:p>
+      <w:pPr>
+        <w:pStyle w:val="ListBullet"/>
+        <w:ind w:left="360"/>
+      </w:pPr>
+      <w:r>
+        <w:rPr>
+          <w:sz w:val="20"/>
+        </w:rPr>
+        <w:t>Committed and pushed to claude/website-ui-ux-design-d87as5 (commit 37ca4d6).</w:t>
+      </w:r>
+    </w:p>
+    <w:p>
+      <w:pPr>
+        <w:spacing w:before="200" w:after="200"/>
+        <w:ind w:left="216" w:right="216"/>
+        <w:shd w:val="clear" w:color="auto" w:fill="FBF3E6"/>
+        <w:pBdr>
+          <w:top w:val="single" w:sz="4" w:space="6" w:color="B8863B"/>
+          <w:bottom w:val="single" w:sz="4" w:space="6" w:color="B8863B"/>
+          <w:left w:val="single" w:sz="10" w:space="6" w:color="B8863B"/>
+          <w:right w:val="single" w:sz="4" w:space="6" w:color="B8863B"/>
+        </w:pBdr>
+      </w:pPr>
+      <w:r>
+        <w:rPr>
+          <w:b/>
+          <w:color w:val="B8863B"/>
+          <w:sz w:val="21"/>
+        </w:rPr>
+        <w:t xml:space="preserve">★ MILESTONE  —  </w:t>
+      </w:r>
+      <w:r>
+        <w:rPr>
+          <w:b/>
+          <w:color w:val="071A2F"/>
+          <w:sz w:val="21"/>
+        </w:rPr>
+        <w:t>The site can now honestly tell a reader what's a verified regulatory fact versus FINTECHOISIS's own analysis, field by field, using a component that's visibly lightweight -- and the classification itself follows the same evidence discipline as the content it describes: only 3 of 7 objects were classified, because only 3 had real evidence to justify it.</w:t>
       </w:r>
     </w:p>
     <w:p>

</xml_diff>

<commit_message>
Add Implementation 07 entry to master Project Prompt document
Logs Prompt 07 (content change and intelligence event model) verbatim
plus its outcome and milestone callout as Entry 8.

Co-Authored-By: Claude Sonnet 5 <noreply@anthropic.com>
Claude-Session: https://claude.ai/code/session_01NXemYjiiKgcxUzQN7iGVyh
</commit_message>
<xml_diff>
--- a/docs/FINTECHOSIS_Master_Project_Prompts.docx
+++ b/docs/FINTECHOSIS_Master_Project_Prompts.docx
@@ -2623,6 +2623,367 @@
           <w:sz w:val="21"/>
         </w:rPr>
         <w:t>The site can now honestly tell a reader what's a verified regulatory fact versus FINTECHOISIS's own analysis, field by field, using a component that's visibly lightweight -- and the classification itself follows the same evidence discipline as the content it describes: only 3 of 7 objects were classified, because only 3 had real evidence to justify it.</w:t>
+      </w:r>
+    </w:p>
+    <w:p>
+      <w:pPr>
+        <w:spacing w:before="80" w:after="80"/>
+        <w:pBdr>
+          <w:bottom w:val="single" w:sz="6" w:space="1" w:color="B8863B"/>
+        </w:pBdr>
+      </w:pPr>
+    </w:p>
+    <w:p>
+      <w:pPr>
+        <w:spacing w:before="280" w:after="40"/>
+      </w:pPr>
+      <w:r>
+        <w:rPr>
+          <w:b/>
+          <w:color w:val="071A2F"/>
+          <w:sz w:val="30"/>
+        </w:rPr>
+        <w:t>8.  Implementation 07 -- Content Change and Intelligence Event Model</w:t>
+      </w:r>
+    </w:p>
+    <w:p>
+      <w:pPr>
+        <w:spacing w:after="200"/>
+      </w:pPr>
+      <w:r>
+        <w:rPr>
+          <w:i/>
+          <w:color w:val="555F70"/>
+          <w:sz w:val="19"/>
+        </w:rPr>
+        <w:t>Date: 22 August 2026    |    Status: Completed and pushed (commit 9e905b0)</w:t>
+      </w:r>
+    </w:p>
+    <w:p>
+      <w:pPr>
+        <w:spacing w:after="80"/>
+      </w:pPr>
+      <w:r>
+        <w:rPr>
+          <w:b/>
+          <w:color w:val="B8863B"/>
+          <w:sz w:val="20"/>
+        </w:rPr>
+        <w:t>PROMPT (verbatim)</w:t>
+      </w:r>
+    </w:p>
+    <w:p>
+      <w:pPr>
+        <w:spacing w:after="80"/>
+        <w:ind w:left="360"/>
+      </w:pPr>
+      <w:r>
+        <w:rPr>
+          <w:rFonts w:ascii="Consolas" w:hAnsi="Consolas"/>
+          <w:sz w:val="20"/>
+        </w:rPr>
+        <w:t>PROMPT 07 -- TURN EVERY NEW CONTENT ADDITION INTO AN INTELLIGENCE EVENT</w:t>
+      </w:r>
+    </w:p>
+    <w:p>
+      <w:pPr>
+        <w:spacing w:after="80"/>
+        <w:ind w:left="360"/>
+      </w:pPr>
+      <w:r>
+        <w:rPr>
+          <w:rFonts w:ascii="Consolas" w:hAnsi="Consolas"/>
+          <w:sz w:val="20"/>
+        </w:rPr>
+        <w:t>FINTECHOSIS -- IMPLEMENTATION 07</w:t>
+      </w:r>
+    </w:p>
+    <w:p>
+      <w:pPr>
+        <w:spacing w:after="80"/>
+        <w:ind w:left="360"/>
+      </w:pPr>
+      <w:r>
+        <w:rPr>
+          <w:rFonts w:ascii="Consolas" w:hAnsi="Consolas"/>
+          <w:sz w:val="20"/>
+        </w:rPr>
+        <w:t>CONTENT CHANGE AND INTELLIGENCE EVENT MODEL</w:t>
+      </w:r>
+    </w:p>
+    <w:p>
+      <w:pPr>
+        <w:spacing w:after="80"/>
+        <w:ind w:left="360"/>
+      </w:pPr>
+      <w:r>
+        <w:rPr>
+          <w:rFonts w:ascii="Consolas" w:hAnsi="Consolas"/>
+          <w:sz w:val="20"/>
+        </w:rPr>
+      </w:r>
+    </w:p>
+    <w:p>
+      <w:pPr>
+        <w:spacing w:after="80"/>
+        <w:ind w:left="360"/>
+      </w:pPr>
+      <w:r>
+        <w:rPr>
+          <w:rFonts w:ascii="Consolas" w:hAnsi="Consolas"/>
+          <w:sz w:val="20"/>
+        </w:rPr>
+        <w:t>Create a lightweight Content Change Event system. Whenever structured content is: CREATED UPDATED CORRECTED ARCHIVED generate a machine-readable change event.</w:t>
+      </w:r>
+    </w:p>
+    <w:p>
+      <w:pPr>
+        <w:spacing w:after="80"/>
+        <w:ind w:left="360"/>
+      </w:pPr>
+      <w:r>
+        <w:rPr>
+          <w:rFonts w:ascii="Consolas" w:hAnsi="Consolas"/>
+          <w:sz w:val="20"/>
+        </w:rPr>
+      </w:r>
+    </w:p>
+    <w:p>
+      <w:pPr>
+        <w:spacing w:after="80"/>
+        <w:ind w:left="360"/>
+      </w:pPr>
+      <w:r>
+        <w:rPr>
+          <w:rFonts w:ascii="Consolas" w:hAnsi="Consolas"/>
+          <w:sz w:val="20"/>
+        </w:rPr>
+        <w:t>Each event should contain: eventId contentId contentType country region topics entities eventType eventDate contentVersion previousVersion where applicable newVersion source significanceStatus.</w:t>
+      </w:r>
+    </w:p>
+    <w:p>
+      <w:pPr>
+        <w:spacing w:after="80"/>
+        <w:ind w:left="360"/>
+      </w:pPr>
+      <w:r>
+        <w:rPr>
+          <w:rFonts w:ascii="Consolas" w:hAnsi="Consolas"/>
+          <w:sz w:val="20"/>
+        </w:rPr>
+      </w:r>
+    </w:p>
+    <w:p>
+      <w:pPr>
+        <w:spacing w:after="80"/>
+        <w:ind w:left="360"/>
+      </w:pPr>
+      <w:r>
+        <w:rPr>
+          <w:rFonts w:ascii="Consolas" w:hAnsi="Consolas"/>
+          <w:sz w:val="20"/>
+        </w:rPr>
+        <w:t>Example: CONTENT UPDATED Country: Vietnam Topic: Cross-border payments Entity: NAPAS Change: New development added Version: 1.4 Date: 2026-08-22.</w:t>
+      </w:r>
+    </w:p>
+    <w:p>
+      <w:pPr>
+        <w:spacing w:after="80"/>
+        <w:ind w:left="360"/>
+      </w:pPr>
+      <w:r>
+        <w:rPr>
+          <w:rFonts w:ascii="Consolas" w:hAnsi="Consolas"/>
+          <w:sz w:val="20"/>
+        </w:rPr>
+      </w:r>
+    </w:p>
+    <w:p>
+      <w:pPr>
+        <w:spacing w:after="80"/>
+        <w:ind w:left="360"/>
+      </w:pPr>
+      <w:r>
+        <w:rPr>
+          <w:rFonts w:ascii="Consolas" w:hAnsi="Consolas"/>
+          <w:sz w:val="20"/>
+        </w:rPr>
+        <w:t>Do not build AI analysis yet. The objective is to establish the event stream that future intelligence analysis can consume. The current website must continue to render normally. Do not introduce Kafka or a complex event-streaming platform. Use the simplest implementation compatible with the current static repository.</w:t>
+      </w:r>
+    </w:p>
+    <w:p>
+      <w:pPr>
+        <w:spacing w:after="80"/>
+        <w:ind w:left="360"/>
+      </w:pPr>
+      <w:r>
+        <w:rPr>
+          <w:rFonts w:ascii="Consolas" w:hAnsi="Consolas"/>
+          <w:sz w:val="20"/>
+        </w:rPr>
+      </w:r>
+    </w:p>
+    <w:p>
+      <w:pPr>
+        <w:spacing w:after="80"/>
+        <w:ind w:left="360"/>
+      </w:pPr>
+      <w:r>
+        <w:rPr>
+          <w:rFonts w:ascii="Consolas" w:hAnsi="Consolas"/>
+          <w:sz w:val="20"/>
+        </w:rPr>
+        <w:t>Provide an example change event generated from one existing content object.</w:t>
+      </w:r>
+    </w:p>
+    <w:p>
+      <w:pPr>
+        <w:spacing w:before="200" w:after="80"/>
+      </w:pPr>
+      <w:r>
+        <w:rPr>
+          <w:b/>
+          <w:color w:val="B8863B"/>
+          <w:sz w:val="20"/>
+        </w:rPr>
+        <w:t>OUTCOME</w:t>
+      </w:r>
+    </w:p>
+    <w:p>
+      <w:pPr>
+        <w:pStyle w:val="ListBullet"/>
+        <w:ind w:left="360"/>
+      </w:pPr>
+      <w:r>
+        <w:rPr>
+          <w:sz w:val="20"/>
+        </w:rPr>
+        <w:t>Designed content-change-event.schema.json covering the prompt's full field list (eventId, contentId, contentType, country, region, topics, entities, eventType, eventDate, contentVersion, previousVersion, newVersion, source, significanceStatus), with eventType restricted to CREATED/UPDATED/CORRECTED/ARCHIVED exactly as named.</w:t>
+      </w:r>
+    </w:p>
+    <w:p>
+      <w:pPr>
+        <w:pStyle w:val="ListBullet"/>
+        <w:ind w:left="360"/>
+      </w:pPr>
+      <w:r>
+        <w:rPr>
+          <w:sz w:val="20"/>
+        </w:rPr>
+        <w:t>Resolved the apparent overlap between contentVersion and newVersion by treating them as two different things: contentVersion is the content MODEL's own schema version (a new contentModelVersion: 1.0.0 marker added to content-object.schema.json), while previousVersion/newVersion are the individual content object's own version number -- not a redundant restatement of the same field.</w:t>
+      </w:r>
+    </w:p>
+    <w:p>
+      <w:pPr>
+        <w:pStyle w:val="ListBullet"/>
+        <w:ind w:left="360"/>
+      </w:pPr>
+      <w:r>
+        <w:rPr>
+          <w:sz w:val="20"/>
+        </w:rPr>
+        <w:t>topics and entities are derived, not separately hand-maintained: computed at generation time from the content object's own topic/subtopic fields and its relationships array (any Research-&gt;Topic or *-&gt;entity edge) -- the same non-duplication discipline the architecture guardrail established for every other generator in this repo.</w:t>
+      </w:r>
+    </w:p>
+    <w:p>
+      <w:pPr>
+        <w:pStyle w:val="ListBullet"/>
+        <w:ind w:left="360"/>
+      </w:pPr>
+      <w:r>
+        <w:rPr>
+          <w:sz w:val="20"/>
+        </w:rPr>
+        <w:t>significanceStatus defaults to UNASSESSED and nothing in the codebase computes it -- an honest placeholder consistent with "do not build AI analysis yet," not a disguised score.</w:t>
+      </w:r>
+    </w:p>
+    <w:p>
+      <w:pPr>
+        <w:pStyle w:val="ListBullet"/>
+        <w:ind w:left="360"/>
+      </w:pPr>
+      <w:r>
+        <w:rPr>
+          <w:sz w:val="20"/>
+        </w:rPr>
+        <w:t>Chose JSON Lines (assets/data/content/events/change-events.jsonl) over a single JSON array: one append per event, O(1), no full-file rewrite as the log grows -- the simplest format compatible with a static, database-free repository that still behaves like a real ordered event stream, per the prompt's explicit "no Kafka / complex event-streaming platform" instruction.</w:t>
+      </w:r>
+    </w:p>
+    <w:p>
+      <w:pPr>
+        <w:pStyle w:val="ListBullet"/>
+        <w:ind w:left="360"/>
+      </w:pPr>
+      <w:r>
+        <w:rPr>
+          <w:sz w:val="20"/>
+        </w:rPr>
+        <w:t>Built scripts/record-content-change-event.js, a dev-time CLI (not a runtime dependency of any live page) that looks up a content object by id and appends one event line.</w:t>
+      </w:r>
+    </w:p>
+    <w:p>
+      <w:pPr>
+        <w:pStyle w:val="ListBullet"/>
+        <w:ind w:left="360"/>
+      </w:pPr>
+      <w:r>
+        <w:rPr>
+          <w:sz w:val="20"/>
+        </w:rPr>
+        <w:t>Generated one real example event rather than a fabricated Vietnam/NAPAS record: bumped intel-cbuae-payment-token-2026's version from 1 to 2, honestly reflecting the real relationships (Implementation 05, commit 2458b2a) and evidence/versionInfo (Implementation 06, commit 37ca4d6) it had already gained but never had its version incremented for, then ran the generator against it. No other content object's version was touched -- the prompt asked for one example.</w:t>
+      </w:r>
+    </w:p>
+    <w:p>
+      <w:pPr>
+        <w:pStyle w:val="ListBullet"/>
+        <w:ind w:left="360"/>
+      </w:pPr>
+      <w:r>
+        <w:rPr>
+          <w:sz w:val="20"/>
+        </w:rPr>
+        <w:t>Re-verified after the version bump that nothing existing moved: content-object-adapter.js still 2/2 PASS, relationships-index.json regeneration byte-identical. Documented the full model in docs/CONTENT_SCHEMA.md §10.</w:t>
+      </w:r>
+    </w:p>
+    <w:p>
+      <w:pPr>
+        <w:pStyle w:val="ListBullet"/>
+        <w:ind w:left="360"/>
+      </w:pPr>
+      <w:r>
+        <w:rPr>
+          <w:sz w:val="20"/>
+        </w:rPr>
+        <w:t>Committed and pushed to claude/website-ui-ux-design-d87as5 (commit 9e905b0).</w:t>
+      </w:r>
+    </w:p>
+    <w:p>
+      <w:pPr>
+        <w:spacing w:before="200" w:after="200"/>
+        <w:ind w:left="216" w:right="216"/>
+        <w:shd w:val="clear" w:color="auto" w:fill="FBF3E6"/>
+        <w:pBdr>
+          <w:top w:val="single" w:sz="4" w:space="6" w:color="B8863B"/>
+          <w:bottom w:val="single" w:sz="4" w:space="6" w:color="B8863B"/>
+          <w:left w:val="single" w:sz="10" w:space="6" w:color="B8863B"/>
+          <w:right w:val="single" w:sz="4" w:space="6" w:color="B8863B"/>
+        </w:pBdr>
+      </w:pPr>
+      <w:r>
+        <w:rPr>
+          <w:b/>
+          <w:color w:val="B8863B"/>
+          <w:sz w:val="21"/>
+        </w:rPr>
+        <w:t xml:space="preserve">★ MILESTONE  —  </w:t>
+      </w:r>
+      <w:r>
+        <w:rPr>
+          <w:b/>
+          <w:color w:val="071A2F"/>
+          <w:sz w:val="21"/>
+        </w:rPr>
+        <w:t>Every content object in the model can now leave a durable, machine-readable trail of its own history -- created, updated, corrected, archived -- as a real append-only event stream, with the one example event generated from a real, already-committed change rather than an invented one. No AI analysis exists yet on purpose: this sprint built the stream a future analysis layer will read, not the analysis itself.</w:t>
       </w:r>
     </w:p>
     <w:p>

</xml_diff>